<commit_message>
update the chapter 3 manuscript
</commit_message>
<xml_diff>
--- a/Rana/Chapter_3/chapter 3 ML_Quasi2D_Manuscript.docx
+++ b/Rana/Chapter_3/chapter 3 ML_Quasi2D_Manuscript.docx
@@ -40,7 +40,7 @@
     </w:p>
     <w:p>
       <w:pPr>
-        <w:spacing w:line="480" w:lineRule="auto"/>
+        <w:spacing w:after="0" w:line="480" w:lineRule="auto"/>
         <w:rPr>
           <w:rFonts w:ascii="Times" w:hAnsi="Times" w:cs="Times"/>
           <w:i/>
@@ -120,7 +120,7 @@
     </w:p>
     <w:p>
       <w:pPr>
-        <w:spacing w:line="480" w:lineRule="auto"/>
+        <w:spacing w:after="0" w:line="480" w:lineRule="auto"/>
         <w:rPr>
           <w:rFonts w:ascii="Times" w:hAnsi="Times" w:cs="Times"/>
         </w:rPr>
@@ -190,7 +190,7 @@
     <w:bookmarkEnd w:id="3"/>
     <w:p>
       <w:pPr>
-        <w:spacing w:line="480" w:lineRule="auto"/>
+        <w:spacing w:after="160" w:line="480" w:lineRule="auto"/>
         <w:jc w:val="both"/>
         <w:rPr>
           <w:rFonts w:ascii="Times New Roman" w:hAnsi="Times New Roman" w:cs="Times New Roman"/>
@@ -200,7 +200,19 @@
         <w:rPr>
           <w:rFonts w:ascii="Times New Roman" w:hAnsi="Times New Roman" w:cs="Times New Roman"/>
         </w:rPr>
-        <w:t>Layered quasi-two-dimensional (quasi-2D) metal-halide perovskites have</w:t>
+        <w:t>Layered quasi-two-dimensional metal-halide perovskites</w:t>
+      </w:r>
+      <w:r>
+        <w:rPr>
+          <w:rFonts w:ascii="Times New Roman" w:hAnsi="Times New Roman" w:cs="Times New Roman"/>
+        </w:rPr>
+        <w:t xml:space="preserve"> (Q2DPes)</w:t>
+      </w:r>
+      <w:r>
+        <w:rPr>
+          <w:rFonts w:ascii="Times New Roman" w:hAnsi="Times New Roman" w:cs="Times New Roman"/>
+        </w:rPr>
+        <w:t xml:space="preserve"> have</w:t>
       </w:r>
       <w:r>
         <w:rPr>
@@ -260,7 +272,25 @@
         <w:rPr>
           <w:rFonts w:ascii="Times New Roman" w:hAnsi="Times New Roman" w:cs="Times New Roman"/>
         </w:rPr>
-        <w:t>Compared with other dimensional perovskite counterparts, quasi-2D perovskites offer more parameters to tune their properties, providing a wider scope for control and making them a complex system. Therefore</w:t>
+        <w:t xml:space="preserve">Compared with other dimensional perovskite counterparts, </w:t>
+      </w:r>
+      <w:r>
+        <w:rPr>
+          <w:rFonts w:ascii="Times New Roman" w:hAnsi="Times New Roman" w:cs="Times New Roman"/>
+        </w:rPr>
+        <w:t>Q2DPes</w:t>
+      </w:r>
+      <w:r>
+        <w:rPr>
+          <w:rFonts w:ascii="Times New Roman" w:hAnsi="Times New Roman" w:cs="Times New Roman"/>
+        </w:rPr>
+        <w:t xml:space="preserve"> </w:t>
+      </w:r>
+      <w:r>
+        <w:rPr>
+          <w:rFonts w:ascii="Times New Roman" w:hAnsi="Times New Roman" w:cs="Times New Roman"/>
+        </w:rPr>
+        <w:t>offer more parameters to tune their properties, providing a wider scope for control and making them a complex system. Therefore</w:t>
       </w:r>
       <w:r>
         <w:rPr>
@@ -449,38 +479,38 @@
         <w:rPr>
           <w:rFonts w:ascii="Times New Roman" w:hAnsi="Times New Roman" w:cs="Times New Roman"/>
         </w:rPr>
-        <w:t xml:space="preserve">major </w:t>
+        <w:t>major part of the</w:t>
+      </w:r>
+      <w:r>
+        <w:rPr>
+          <w:rFonts w:ascii="Times New Roman" w:hAnsi="Times New Roman" w:cs="Times New Roman"/>
+        </w:rPr>
+        <w:t xml:space="preserve"> visible spectrum</w:t>
+      </w:r>
+      <w:r>
+        <w:rPr>
+          <w:rFonts w:ascii="Times New Roman" w:hAnsi="Times New Roman" w:cs="Times New Roman"/>
+        </w:rPr>
+        <w:t xml:space="preserve">. </w:t>
+      </w:r>
+      <w:r>
+        <w:rPr>
+          <w:rFonts w:ascii="Times New Roman" w:hAnsi="Times New Roman" w:cs="Times New Roman"/>
+        </w:rPr>
+        <w:t xml:space="preserve">In contrast, </w:t>
+      </w:r>
+      <w:r>
+        <w:rPr>
+          <w:rFonts w:ascii="Times New Roman" w:hAnsi="Times New Roman" w:cs="Times New Roman"/>
+        </w:rPr>
+        <w:t xml:space="preserve">predicting device EQE using the same workflow and style </w:t>
       </w:r>
       <w:r>
         <w:rPr>
           <w:rFonts w:ascii="Times New Roman" w:hAnsi="Times New Roman" w:cs="Times New Roman"/>
         </w:rPr>
         <w:lastRenderedPageBreak/>
-        <w:t>part of the</w:t>
-      </w:r>
-      <w:r>
-        <w:rPr>
-          <w:rFonts w:ascii="Times New Roman" w:hAnsi="Times New Roman" w:cs="Times New Roman"/>
-        </w:rPr>
-        <w:t xml:space="preserve"> visible spectrum</w:t>
-      </w:r>
-      <w:r>
-        <w:rPr>
-          <w:rFonts w:ascii="Times New Roman" w:hAnsi="Times New Roman" w:cs="Times New Roman"/>
-        </w:rPr>
-        <w:t xml:space="preserve">. </w:t>
-      </w:r>
-      <w:r>
-        <w:rPr>
-          <w:rFonts w:ascii="Times New Roman" w:hAnsi="Times New Roman" w:cs="Times New Roman"/>
-        </w:rPr>
-        <w:t xml:space="preserve">In contrast, </w:t>
-      </w:r>
-      <w:r>
-        <w:rPr>
-          <w:rFonts w:ascii="Times New Roman" w:hAnsi="Times New Roman" w:cs="Times New Roman"/>
-        </w:rPr>
-        <w:t xml:space="preserve">predicting device EQE using the same workflow and style of data </w:t>
+        <w:t xml:space="preserve">of data </w:t>
       </w:r>
       <w:r>
         <w:rPr>
@@ -546,6 +576,7 @@
     </w:p>
     <w:p>
       <w:pPr>
+        <w:spacing w:after="160"/>
         <w:rPr>
           <w:rFonts w:ascii="Times New Roman" w:hAnsi="Times New Roman" w:cs="Times New Roman"/>
           <w:b/>
@@ -564,7 +595,7 @@
     <w:p>
       <w:pPr>
         <w:pStyle w:val="FirstParagraph"/>
-        <w:spacing w:line="480" w:lineRule="auto"/>
+        <w:spacing w:before="0" w:after="0" w:line="480" w:lineRule="auto"/>
         <w:jc w:val="both"/>
         <w:rPr>
           <w:rFonts w:ascii="Times New Roman" w:hAnsi="Times New Roman" w:cs="Times New Roman"/>
@@ -905,25 +936,25 @@
         <w:rPr>
           <w:rFonts w:ascii="Times New Roman" w:hAnsi="Times New Roman" w:cs="Times New Roman"/>
         </w:rPr>
-        <w:t xml:space="preserve"> (</w:t>
-      </w:r>
-      <w:r>
-        <w:rPr>
-          <w:rFonts w:ascii="Times New Roman" w:hAnsi="Times New Roman" w:cs="Times New Roman"/>
-        </w:rPr>
-        <w:t>quasi-2D</w:t>
-      </w:r>
-      <w:r>
-        <w:rPr>
-          <w:rFonts w:ascii="Times New Roman" w:hAnsi="Times New Roman" w:cs="Times New Roman"/>
-        </w:rPr>
-        <w:t>)</w:t>
-      </w:r>
-      <w:r>
-        <w:rPr>
-          <w:rFonts w:ascii="Times New Roman" w:hAnsi="Times New Roman" w:cs="Times New Roman"/>
-        </w:rPr>
-        <w:t xml:space="preserve"> metal-halide perovskites have emerged as a versatile </w:t>
+        <w:t xml:space="preserve"> </w:t>
+      </w:r>
+      <w:r>
+        <w:rPr>
+          <w:rFonts w:ascii="Times New Roman" w:hAnsi="Times New Roman" w:cs="Times New Roman"/>
+        </w:rPr>
+        <w:t xml:space="preserve">metal-halide perovskites </w:t>
+      </w:r>
+      <w:r>
+        <w:rPr>
+          <w:rFonts w:ascii="Times New Roman" w:hAnsi="Times New Roman" w:cs="Times New Roman"/>
+        </w:rPr>
+        <w:t xml:space="preserve">(Q2DPes) </w:t>
+      </w:r>
+      <w:r>
+        <w:rPr>
+          <w:rFonts w:ascii="Times New Roman" w:hAnsi="Times New Roman" w:cs="Times New Roman"/>
+        </w:rPr>
+        <w:t xml:space="preserve">have emerged as a versatile </w:t>
       </w:r>
       <w:r>
         <w:rPr>
@@ -1314,7 +1345,7 @@
         <w:rPr>
           <w:rFonts w:ascii="Times New Roman" w:hAnsi="Times New Roman" w:cs="Times New Roman"/>
         </w:rPr>
-        <w:t>quasi-2D</w:t>
+        <w:t>Q2DPe</w:t>
       </w:r>
       <w:r>
         <w:rPr>
@@ -1326,18 +1357,6 @@
         <w:rPr>
           <w:rFonts w:ascii="Times New Roman" w:hAnsi="Times New Roman" w:cs="Times New Roman"/>
         </w:rPr>
-        <w:t>perovskite</w:t>
-      </w:r>
-      <w:r>
-        <w:rPr>
-          <w:rFonts w:ascii="Times New Roman" w:hAnsi="Times New Roman" w:cs="Times New Roman"/>
-        </w:rPr>
-        <w:t xml:space="preserve"> </w:t>
-      </w:r>
-      <w:r>
-        <w:rPr>
-          <w:rFonts w:ascii="Times New Roman" w:hAnsi="Times New Roman" w:cs="Times New Roman"/>
-        </w:rPr>
         <w:t xml:space="preserve">materials are formed by intercalating bulky organic spacer cations into the 3D framework, which </w:t>
       </w:r>
       <w:r>
@@ -1350,19 +1369,19 @@
         <w:rPr>
           <w:rFonts w:ascii="Times New Roman" w:hAnsi="Times New Roman" w:cs="Times New Roman"/>
         </w:rPr>
-        <w:t xml:space="preserve"> the inorganic octahedra into layers of thickness n. These quasi-2D </w:t>
-      </w:r>
-      <w:r>
-        <w:rPr>
-          <w:rFonts w:ascii="Times New Roman" w:hAnsi="Times New Roman" w:cs="Times New Roman"/>
-        </w:rPr>
-        <w:t>perovskite</w:t>
-      </w:r>
-      <w:r>
-        <w:rPr>
-          <w:rFonts w:ascii="Times New Roman" w:hAnsi="Times New Roman" w:cs="Times New Roman"/>
-        </w:rPr>
-        <w:t xml:space="preserve"> </w:t>
+        <w:t xml:space="preserve"> the inorganic octahedra into layers of thickness n. These </w:t>
+      </w:r>
+      <w:r>
+        <w:rPr>
+          <w:rFonts w:ascii="Times New Roman" w:hAnsi="Times New Roman" w:cs="Times New Roman"/>
+        </w:rPr>
+        <w:t>Q2DPe</w:t>
+      </w:r>
+      <w:r>
+        <w:rPr>
+          <w:rFonts w:ascii="Times New Roman" w:hAnsi="Times New Roman" w:cs="Times New Roman"/>
+        </w:rPr>
+        <w:t xml:space="preserve">s </w:t>
       </w:r>
       <w:r>
         <w:rPr>
@@ -1887,7 +1906,7 @@
     <w:p>
       <w:pPr>
         <w:pStyle w:val="FirstParagraph"/>
-        <w:spacing w:line="480" w:lineRule="auto"/>
+        <w:spacing w:before="0" w:after="0" w:line="480" w:lineRule="auto"/>
         <w:ind w:firstLine="720"/>
         <w:jc w:val="both"/>
         <w:rPr>
@@ -1898,7 +1917,25 @@
         <w:rPr>
           <w:rFonts w:ascii="Times New Roman" w:hAnsi="Times New Roman" w:cs="Times New Roman"/>
         </w:rPr>
-        <w:t>Since the parameter space is large in quasi-2D perovskites, unlike in their 3D counterparts, their outcomes are</w:t>
+        <w:t xml:space="preserve">Since the parameter space is large in </w:t>
+      </w:r>
+      <w:r>
+        <w:rPr>
+          <w:rFonts w:ascii="Times New Roman" w:hAnsi="Times New Roman" w:cs="Times New Roman"/>
+        </w:rPr>
+        <w:t>Q2DPe</w:t>
+      </w:r>
+      <w:r>
+        <w:rPr>
+          <w:rFonts w:ascii="Times New Roman" w:hAnsi="Times New Roman" w:cs="Times New Roman"/>
+        </w:rPr>
+        <w:t>s</w:t>
+      </w:r>
+      <w:r>
+        <w:rPr>
+          <w:rFonts w:ascii="Times New Roman" w:hAnsi="Times New Roman" w:cs="Times New Roman"/>
+        </w:rPr>
+        <w:t>, unlike in their 3D counterparts, their outcomes are</w:t>
       </w:r>
       <w:r>
         <w:rPr>
@@ -1970,20 +2007,26 @@
         <w:rPr>
           <w:rFonts w:ascii="Times New Roman" w:hAnsi="Times New Roman" w:cs="Times New Roman"/>
         </w:rPr>
+        <w:t xml:space="preserve">Traditional materials development for perovskite optoelectronics has </w:t>
+      </w:r>
+      <w:r>
+        <w:rPr>
+          <w:rFonts w:ascii="Times New Roman" w:hAnsi="Times New Roman" w:cs="Times New Roman"/>
+        </w:rPr>
+        <w:t xml:space="preserve">always </w:t>
+      </w:r>
+      <w:r>
+        <w:rPr>
+          <w:rFonts w:ascii="Times New Roman" w:hAnsi="Times New Roman" w:cs="Times New Roman"/>
+        </w:rPr>
+        <w:t xml:space="preserve">depended on trial-and-error </w:t>
+      </w:r>
+      <w:r>
+        <w:rPr>
+          <w:rFonts w:ascii="Times New Roman" w:hAnsi="Times New Roman" w:cs="Times New Roman"/>
+        </w:rPr>
         <w:lastRenderedPageBreak/>
-        <w:t xml:space="preserve">Traditional materials development for perovskite optoelectronics has </w:t>
-      </w:r>
-      <w:r>
-        <w:rPr>
-          <w:rFonts w:ascii="Times New Roman" w:hAnsi="Times New Roman" w:cs="Times New Roman"/>
-        </w:rPr>
-        <w:t xml:space="preserve">always </w:t>
-      </w:r>
-      <w:r>
-        <w:rPr>
-          <w:rFonts w:ascii="Times New Roman" w:hAnsi="Times New Roman" w:cs="Times New Roman"/>
-        </w:rPr>
-        <w:t>depended on trial-and-error experimentation</w:t>
+        <w:t>experimentation</w:t>
       </w:r>
       <w:r>
         <w:rPr>
@@ -2494,7 +2537,7 @@
     <w:p>
       <w:pPr>
         <w:pStyle w:val="FirstParagraph"/>
-        <w:spacing w:line="480" w:lineRule="auto"/>
+        <w:spacing w:before="0" w:after="0" w:line="480" w:lineRule="auto"/>
         <w:ind w:firstLine="720"/>
         <w:jc w:val="both"/>
         <w:rPr>
@@ -2826,19 +2869,49 @@
         <w:rPr>
           <w:rFonts w:ascii="Times New Roman" w:hAnsi="Times New Roman" w:cs="Times New Roman"/>
         </w:rPr>
-        <w:t>focused on the emission of quasi-2D perovskites</w:t>
-      </w:r>
-      <w:r>
-        <w:rPr>
-          <w:rFonts w:ascii="Times New Roman" w:hAnsi="Times New Roman" w:cs="Times New Roman"/>
-        </w:rPr>
-        <w:t xml:space="preserve"> and LEDs. </w:t>
-      </w:r>
-      <w:r>
-        <w:rPr>
-          <w:rFonts w:ascii="Times New Roman" w:hAnsi="Times New Roman" w:cs="Times New Roman"/>
-        </w:rPr>
-        <w:t xml:space="preserve">Prior work on quasi-2D perovskites </w:t>
+        <w:t xml:space="preserve">focused on the emission of </w:t>
+      </w:r>
+      <w:r>
+        <w:rPr>
+          <w:rFonts w:ascii="Times New Roman" w:hAnsi="Times New Roman" w:cs="Times New Roman"/>
+        </w:rPr>
+        <w:t>Q2DPe</w:t>
+      </w:r>
+      <w:r>
+        <w:rPr>
+          <w:rFonts w:ascii="Times New Roman" w:hAnsi="Times New Roman" w:cs="Times New Roman"/>
+        </w:rPr>
+        <w:t xml:space="preserve">s </w:t>
+      </w:r>
+      <w:r>
+        <w:rPr>
+          <w:rFonts w:ascii="Times New Roman" w:hAnsi="Times New Roman" w:cs="Times New Roman"/>
+        </w:rPr>
+        <w:t xml:space="preserve">and LEDs. </w:t>
+      </w:r>
+      <w:r>
+        <w:rPr>
+          <w:rFonts w:ascii="Times New Roman" w:hAnsi="Times New Roman" w:cs="Times New Roman"/>
+        </w:rPr>
+        <w:t xml:space="preserve">Prior work on </w:t>
+      </w:r>
+      <w:r>
+        <w:rPr>
+          <w:rFonts w:ascii="Times New Roman" w:hAnsi="Times New Roman" w:cs="Times New Roman"/>
+        </w:rPr>
+        <w:t>Q2DPe</w:t>
+      </w:r>
+      <w:r>
+        <w:rPr>
+          <w:rFonts w:ascii="Times New Roman" w:hAnsi="Times New Roman" w:cs="Times New Roman"/>
+        </w:rPr>
+        <w:t>s</w:t>
+      </w:r>
+      <w:r>
+        <w:rPr>
+          <w:rFonts w:ascii="Times New Roman" w:hAnsi="Times New Roman" w:cs="Times New Roman"/>
+        </w:rPr>
+        <w:t xml:space="preserve"> </w:t>
       </w:r>
       <w:r>
         <w:rPr>
@@ -3040,7 +3113,25 @@
         <w:rPr>
           <w:rFonts w:ascii="Times New Roman" w:hAnsi="Times New Roman" w:cs="Times New Roman"/>
         </w:rPr>
-        <w:t xml:space="preserve">However, several gaps persist relative to the needs of quasi-2D LED researchers working across full visible-range color tuning. </w:t>
+        <w:t xml:space="preserve">However, several gaps persist relative to the needs of </w:t>
+      </w:r>
+      <w:r>
+        <w:rPr>
+          <w:rFonts w:ascii="Times New Roman" w:hAnsi="Times New Roman" w:cs="Times New Roman"/>
+        </w:rPr>
+        <w:t>Q2DPe</w:t>
+      </w:r>
+      <w:r>
+        <w:rPr>
+          <w:rFonts w:ascii="Times New Roman" w:hAnsi="Times New Roman" w:cs="Times New Roman"/>
+        </w:rPr>
+        <w:t>s based</w:t>
+      </w:r>
+      <w:r>
+        <w:rPr>
+          <w:rFonts w:ascii="Times New Roman" w:hAnsi="Times New Roman" w:cs="Times New Roman"/>
+        </w:rPr>
+        <w:t xml:space="preserve"> LED researchers working across full visible-range color tuning. </w:t>
       </w:r>
       <w:r>
         <w:rPr>
@@ -3100,20 +3191,20 @@
         <w:rPr>
           <w:rFonts w:ascii="Times New Roman" w:hAnsi="Times New Roman" w:cs="Times New Roman"/>
         </w:rPr>
-        <w:t xml:space="preserve">without explicitly encoding primary and secondary organic spacer structures through </w:t>
+        <w:t>without explicitly encoding primary and secondary organic spacer structures through cheminformatics descriptors.</w:t>
+      </w:r>
+      <w:r>
+        <w:rPr>
+          <w:rFonts w:ascii="Times New Roman" w:hAnsi="Times New Roman" w:cs="Times New Roman"/>
+        </w:rPr>
+        <w:t xml:space="preserve"> </w:t>
       </w:r>
       <w:r>
         <w:rPr>
           <w:rFonts w:ascii="Times New Roman" w:hAnsi="Times New Roman" w:cs="Times New Roman"/>
         </w:rPr>
         <w:lastRenderedPageBreak/>
-        <w:t>cheminformatics descriptors.</w:t>
-      </w:r>
-      <w:r>
-        <w:rPr>
-          <w:rFonts w:ascii="Times New Roman" w:hAnsi="Times New Roman" w:cs="Times New Roman"/>
-        </w:rPr>
-        <w:t xml:space="preserve"> In addition, we tried to answer </w:t>
+        <w:t xml:space="preserve">In addition, we tried to answer </w:t>
       </w:r>
       <w:r>
         <w:rPr>
@@ -3149,7 +3240,7 @@
     <w:p>
       <w:pPr>
         <w:pStyle w:val="BodyText"/>
-        <w:spacing w:line="480" w:lineRule="auto"/>
+        <w:spacing w:before="0" w:after="160" w:line="480" w:lineRule="auto"/>
         <w:jc w:val="both"/>
         <w:rPr>
           <w:rFonts w:ascii="Times New Roman" w:hAnsi="Times New Roman" w:cs="Times New Roman"/>
@@ -3339,7 +3430,7 @@
     <w:p>
       <w:pPr>
         <w:pStyle w:val="BodyText"/>
-        <w:spacing w:line="480" w:lineRule="auto"/>
+        <w:spacing w:before="0" w:after="160" w:line="480" w:lineRule="auto"/>
         <w:ind w:firstLine="720"/>
         <w:jc w:val="both"/>
         <w:rPr>
@@ -3362,7 +3453,25 @@
         <w:rPr>
           <w:rFonts w:ascii="Times New Roman" w:hAnsi="Times New Roman" w:cs="Times New Roman"/>
         </w:rPr>
-        <w:t xml:space="preserve">aforementioned gaps, leveraging a dataset of quasi-2D perovskites extracted from the literature </w:t>
+        <w:t xml:space="preserve">aforementioned gaps, leveraging a dataset of </w:t>
+      </w:r>
+      <w:r>
+        <w:rPr>
+          <w:rFonts w:ascii="Times New Roman" w:hAnsi="Times New Roman" w:cs="Times New Roman"/>
+        </w:rPr>
+        <w:t>Q2DPe</w:t>
+      </w:r>
+      <w:r>
+        <w:rPr>
+          <w:rFonts w:ascii="Times New Roman" w:hAnsi="Times New Roman" w:cs="Times New Roman"/>
+        </w:rPr>
+        <w:t xml:space="preserve">s </w:t>
+      </w:r>
+      <w:r>
+        <w:rPr>
+          <w:rFonts w:ascii="Times New Roman" w:hAnsi="Times New Roman" w:cs="Times New Roman"/>
+        </w:rPr>
+        <w:t xml:space="preserve">extracted from the literature </w:t>
       </w:r>
       <w:r>
         <w:rPr>
@@ -3573,59 +3682,53 @@
         <w:rPr>
           <w:rFonts w:ascii="Times New Roman" w:hAnsi="Times New Roman" w:cs="Times New Roman"/>
         </w:rPr>
-        <w:t xml:space="preserve">n top of the resulting dataset in Snowflake, the remaining data engineering </w:t>
+        <w:t>n top of the resulting dataset in Snowflake, the remaining data engineering operations were performed in Python (</w:t>
+      </w:r>
+      <w:proofErr w:type="spellStart"/>
+      <w:r>
+        <w:rPr>
+          <w:rFonts w:ascii="Times New Roman" w:hAnsi="Times New Roman" w:cs="Times New Roman"/>
+        </w:rPr>
+        <w:t>Jupyter</w:t>
+      </w:r>
+      <w:proofErr w:type="spellEnd"/>
+      <w:r>
+        <w:rPr>
+          <w:rFonts w:ascii="Times New Roman" w:hAnsi="Times New Roman" w:cs="Times New Roman"/>
+        </w:rPr>
+        <w:t xml:space="preserve"> Notebook) using the pandas </w:t>
+      </w:r>
+      <w:proofErr w:type="spellStart"/>
+      <w:r>
+        <w:rPr>
+          <w:rFonts w:ascii="Times New Roman" w:hAnsi="Times New Roman" w:cs="Times New Roman"/>
+        </w:rPr>
+        <w:t>dataframes</w:t>
+      </w:r>
+      <w:proofErr w:type="spellEnd"/>
+      <w:r>
+        <w:rPr>
+          <w:rFonts w:ascii="Times New Roman" w:hAnsi="Times New Roman" w:cs="Times New Roman"/>
+        </w:rPr>
+        <w:t>.</w:t>
+      </w:r>
+      <w:r>
+        <w:rPr>
+          <w:rFonts w:ascii="Times New Roman" w:hAnsi="Times New Roman" w:cs="Times New Roman"/>
+        </w:rPr>
+        <w:t xml:space="preserve"> </w:t>
+      </w:r>
+      <w:r>
+        <w:rPr>
+          <w:rFonts w:ascii="Times New Roman" w:hAnsi="Times New Roman" w:cs="Times New Roman"/>
+        </w:rPr>
+        <w:t xml:space="preserve">Thereafter, </w:t>
       </w:r>
       <w:r>
         <w:rPr>
           <w:rFonts w:ascii="Times New Roman" w:hAnsi="Times New Roman" w:cs="Times New Roman"/>
         </w:rPr>
         <w:lastRenderedPageBreak/>
-        <w:t>operations were performed in Python (</w:t>
-      </w:r>
-      <w:proofErr w:type="spellStart"/>
-      <w:r>
-        <w:rPr>
-          <w:rFonts w:ascii="Times New Roman" w:hAnsi="Times New Roman" w:cs="Times New Roman"/>
-        </w:rPr>
-        <w:t>Jupyter</w:t>
-      </w:r>
-      <w:proofErr w:type="spellEnd"/>
-      <w:r>
-        <w:rPr>
-          <w:rFonts w:ascii="Times New Roman" w:hAnsi="Times New Roman" w:cs="Times New Roman"/>
-        </w:rPr>
-        <w:t xml:space="preserve"> Notebook) using the pandas </w:t>
-      </w:r>
-      <w:proofErr w:type="spellStart"/>
-      <w:r>
-        <w:rPr>
-          <w:rFonts w:ascii="Times New Roman" w:hAnsi="Times New Roman" w:cs="Times New Roman"/>
-        </w:rPr>
-        <w:t>dataframes</w:t>
-      </w:r>
-      <w:proofErr w:type="spellEnd"/>
-      <w:r>
-        <w:rPr>
-          <w:rFonts w:ascii="Times New Roman" w:hAnsi="Times New Roman" w:cs="Times New Roman"/>
-        </w:rPr>
-        <w:t>.</w:t>
-      </w:r>
-      <w:r>
-        <w:rPr>
-          <w:rFonts w:ascii="Times New Roman" w:hAnsi="Times New Roman" w:cs="Times New Roman"/>
-        </w:rPr>
-        <w:t xml:space="preserve"> </w:t>
-      </w:r>
-      <w:r>
-        <w:rPr>
-          <w:rFonts w:ascii="Times New Roman" w:hAnsi="Times New Roman" w:cs="Times New Roman"/>
-        </w:rPr>
-        <w:t xml:space="preserve">Thereafter, </w:t>
-      </w:r>
-      <w:r>
-        <w:rPr>
-          <w:rFonts w:ascii="Times New Roman" w:hAnsi="Times New Roman" w:cs="Times New Roman"/>
-        </w:rPr>
         <w:t xml:space="preserve">Simplified Molecular Input Line Entry System </w:t>
       </w:r>
       <w:r>
@@ -4034,7 +4137,7 @@
     <w:p>
       <w:pPr>
         <w:pStyle w:val="BodyText"/>
-        <w:spacing w:line="480" w:lineRule="auto"/>
+        <w:spacing w:before="0" w:after="0" w:line="480" w:lineRule="auto"/>
         <w:jc w:val="both"/>
         <w:rPr>
           <w:rFonts w:ascii="Times New Roman" w:hAnsi="Times New Roman" w:cs="Times New Roman"/>
@@ -4053,6 +4156,7 @@
     </w:p>
     <w:p>
       <w:pPr>
+        <w:spacing w:after="0"/>
         <w:rPr>
           <w:rFonts w:ascii="Times New Roman" w:hAnsi="Times New Roman" w:cs="Times New Roman"/>
           <w:b/>
@@ -4074,7 +4178,7 @@
           <w:b/>
           <w:bCs/>
         </w:rPr>
-        <w:t>ML models for emission energies</w:t>
+        <w:t xml:space="preserve">ML </w:t>
       </w:r>
       <w:r>
         <w:rPr>
@@ -4082,7 +4186,55 @@
           <w:b/>
           <w:bCs/>
         </w:rPr>
-        <w:t xml:space="preserve"> prediction</w:t>
+        <w:t>M</w:t>
+      </w:r>
+      <w:r>
+        <w:rPr>
+          <w:rFonts w:ascii="Times New Roman" w:hAnsi="Times New Roman" w:cs="Times New Roman"/>
+          <w:b/>
+          <w:bCs/>
+        </w:rPr>
+        <w:t xml:space="preserve">odels for </w:t>
+      </w:r>
+      <w:r>
+        <w:rPr>
+          <w:rFonts w:ascii="Times New Roman" w:hAnsi="Times New Roman" w:cs="Times New Roman"/>
+          <w:b/>
+          <w:bCs/>
+        </w:rPr>
+        <w:t>E</w:t>
+      </w:r>
+      <w:r>
+        <w:rPr>
+          <w:rFonts w:ascii="Times New Roman" w:hAnsi="Times New Roman" w:cs="Times New Roman"/>
+          <w:b/>
+          <w:bCs/>
+        </w:rPr>
+        <w:t xml:space="preserve">mission </w:t>
+      </w:r>
+      <w:r>
+        <w:rPr>
+          <w:rFonts w:ascii="Times New Roman" w:hAnsi="Times New Roman" w:cs="Times New Roman"/>
+          <w:b/>
+          <w:bCs/>
+        </w:rPr>
+        <w:t>Energy</w:t>
+      </w:r>
+      <w:r>
+        <w:rPr>
+          <w:rFonts w:ascii="Times New Roman" w:hAnsi="Times New Roman" w:cs="Times New Roman"/>
+          <w:b/>
+          <w:bCs/>
+        </w:rPr>
+        <w:t xml:space="preserve"> </w:t>
+      </w:r>
+      <w:r>
+        <w:rPr>
+          <w:rFonts w:ascii="Times New Roman" w:hAnsi="Times New Roman" w:cs="Times New Roman"/>
+          <w:b/>
+          <w:bCs/>
+        </w:rPr>
+        <w:t>Prediction</w:t>
       </w:r>
     </w:p>
     <w:p>
@@ -4275,86 +4427,86 @@
         <w:rPr>
           <w:rFonts w:ascii="Times New Roman" w:hAnsi="Times New Roman" w:cs="Times New Roman"/>
         </w:rPr>
-        <w:t xml:space="preserve">, </w:t>
+        <w:t>, mirroring</w:t>
+      </w:r>
+      <w:r>
+        <w:rPr>
+          <w:rFonts w:ascii="Times New Roman" w:hAnsi="Times New Roman" w:cs="Times New Roman"/>
+        </w:rPr>
+        <w:t xml:space="preserve"> the </w:t>
+      </w:r>
+      <w:r>
+        <w:rPr>
+          <w:rFonts w:ascii="Times New Roman" w:hAnsi="Times New Roman" w:cs="Times New Roman"/>
+        </w:rPr>
+        <w:t xml:space="preserve">available literature </w:t>
+      </w:r>
+      <w:r>
+        <w:rPr>
+          <w:rFonts w:ascii="Times New Roman" w:hAnsi="Times New Roman" w:cs="Times New Roman"/>
+        </w:rPr>
+        <w:t>to</w:t>
+      </w:r>
+      <w:r>
+        <w:rPr>
+          <w:rFonts w:ascii="Times New Roman" w:hAnsi="Times New Roman" w:cs="Times New Roman"/>
+        </w:rPr>
+        <w:t xml:space="preserve"> date</w:t>
+      </w:r>
+      <w:r>
+        <w:rPr>
+          <w:rFonts w:ascii="Times New Roman" w:hAnsi="Times New Roman" w:cs="Times New Roman"/>
+        </w:rPr>
+        <w:t xml:space="preserve">. About </w:t>
+      </w:r>
+      <w:r>
+        <w:rPr>
+          <w:rFonts w:ascii="Times New Roman" w:hAnsi="Times New Roman" w:cs="Times New Roman"/>
+        </w:rPr>
+        <w:t>≈</w:t>
+      </w:r>
+      <w:r>
+        <w:rPr>
+          <w:rFonts w:ascii="Times New Roman" w:hAnsi="Times New Roman" w:cs="Times New Roman"/>
+        </w:rPr>
+        <w:t xml:space="preserve"> </w:t>
+      </w:r>
+      <w:r>
+        <w:rPr>
+          <w:rFonts w:ascii="Times New Roman" w:hAnsi="Times New Roman" w:cs="Times New Roman"/>
+        </w:rPr>
+        <w:t xml:space="preserve">69% of </w:t>
+      </w:r>
+      <w:r>
+        <w:rPr>
+          <w:rFonts w:ascii="Times New Roman" w:hAnsi="Times New Roman" w:cs="Times New Roman"/>
+        </w:rPr>
+        <w:t>283 records</w:t>
+      </w:r>
+      <w:r>
+        <w:rPr>
+          <w:rFonts w:ascii="Times New Roman" w:hAnsi="Times New Roman" w:cs="Times New Roman"/>
+        </w:rPr>
+        <w:t xml:space="preserve"> fall between 480 </w:t>
+      </w:r>
+      <w:r>
+        <w:rPr>
+          <w:rFonts w:ascii="Times New Roman" w:hAnsi="Times New Roman" w:cs="Times New Roman"/>
+        </w:rPr>
+        <w:t xml:space="preserve">nm </w:t>
+      </w:r>
+      <w:r>
+        <w:rPr>
+          <w:rFonts w:ascii="Times New Roman" w:hAnsi="Times New Roman" w:cs="Times New Roman"/>
+        </w:rPr>
+        <w:t xml:space="preserve">and </w:t>
       </w:r>
       <w:r>
         <w:rPr>
           <w:rFonts w:ascii="Times New Roman" w:hAnsi="Times New Roman" w:cs="Times New Roman"/>
         </w:rPr>
         <w:lastRenderedPageBreak/>
-        <w:t>mirroring</w:t>
-      </w:r>
-      <w:r>
-        <w:rPr>
-          <w:rFonts w:ascii="Times New Roman" w:hAnsi="Times New Roman" w:cs="Times New Roman"/>
-        </w:rPr>
-        <w:t xml:space="preserve"> the </w:t>
-      </w:r>
-      <w:r>
-        <w:rPr>
-          <w:rFonts w:ascii="Times New Roman" w:hAnsi="Times New Roman" w:cs="Times New Roman"/>
-        </w:rPr>
-        <w:t xml:space="preserve">available literature </w:t>
-      </w:r>
-      <w:r>
-        <w:rPr>
-          <w:rFonts w:ascii="Times New Roman" w:hAnsi="Times New Roman" w:cs="Times New Roman"/>
-        </w:rPr>
-        <w:t>to</w:t>
-      </w:r>
-      <w:r>
-        <w:rPr>
-          <w:rFonts w:ascii="Times New Roman" w:hAnsi="Times New Roman" w:cs="Times New Roman"/>
-        </w:rPr>
-        <w:t xml:space="preserve"> date</w:t>
-      </w:r>
-      <w:r>
-        <w:rPr>
-          <w:rFonts w:ascii="Times New Roman" w:hAnsi="Times New Roman" w:cs="Times New Roman"/>
-        </w:rPr>
-        <w:t xml:space="preserve">. About </w:t>
-      </w:r>
-      <w:r>
-        <w:rPr>
-          <w:rFonts w:ascii="Times New Roman" w:hAnsi="Times New Roman" w:cs="Times New Roman"/>
-        </w:rPr>
-        <w:t>≈</w:t>
-      </w:r>
-      <w:r>
-        <w:rPr>
-          <w:rFonts w:ascii="Times New Roman" w:hAnsi="Times New Roman" w:cs="Times New Roman"/>
-        </w:rPr>
-        <w:t xml:space="preserve"> </w:t>
-      </w:r>
-      <w:r>
-        <w:rPr>
-          <w:rFonts w:ascii="Times New Roman" w:hAnsi="Times New Roman" w:cs="Times New Roman"/>
-        </w:rPr>
-        <w:t xml:space="preserve">69% of </w:t>
-      </w:r>
-      <w:r>
-        <w:rPr>
-          <w:rFonts w:ascii="Times New Roman" w:hAnsi="Times New Roman" w:cs="Times New Roman"/>
-        </w:rPr>
-        <w:t>283 records</w:t>
-      </w:r>
-      <w:r>
-        <w:rPr>
-          <w:rFonts w:ascii="Times New Roman" w:hAnsi="Times New Roman" w:cs="Times New Roman"/>
-        </w:rPr>
-        <w:t xml:space="preserve"> fall between 480 </w:t>
-      </w:r>
-      <w:r>
-        <w:rPr>
-          <w:rFonts w:ascii="Times New Roman" w:hAnsi="Times New Roman" w:cs="Times New Roman"/>
-        </w:rPr>
-        <w:t xml:space="preserve">nm </w:t>
-      </w:r>
-      <w:r>
-        <w:rPr>
-          <w:rFonts w:ascii="Times New Roman" w:hAnsi="Times New Roman" w:cs="Times New Roman"/>
-        </w:rPr>
-        <w:t xml:space="preserve">and 550 nm (green–yellow), </w:t>
+        <w:t xml:space="preserve">550 nm (green–yellow), </w:t>
       </w:r>
       <w:r>
         <w:rPr>
@@ -4450,7 +4602,7 @@
     <w:p>
       <w:pPr>
         <w:pStyle w:val="BodyText"/>
-        <w:spacing w:line="480" w:lineRule="auto"/>
+        <w:spacing w:before="0" w:after="0" w:line="480" w:lineRule="auto"/>
         <w:jc w:val="both"/>
         <w:rPr>
           <w:rFonts w:ascii="Times New Roman" w:hAnsi="Times New Roman" w:cs="Times New Roman"/>
@@ -4515,7 +4667,7 @@
     <w:p>
       <w:pPr>
         <w:pStyle w:val="BodyText"/>
-        <w:spacing w:line="480" w:lineRule="auto"/>
+        <w:spacing w:before="0" w:after="160" w:line="480" w:lineRule="auto"/>
         <w:jc w:val="both"/>
         <w:rPr>
           <w:rFonts w:ascii="Times New Roman" w:hAnsi="Times New Roman" w:cs="Times New Roman"/>
@@ -4619,7 +4771,7 @@
     <w:p>
       <w:pPr>
         <w:pStyle w:val="FirstParagraph"/>
-        <w:spacing w:line="480" w:lineRule="auto"/>
+        <w:spacing w:before="0" w:after="0" w:line="480" w:lineRule="auto"/>
         <w:ind w:firstLine="720"/>
         <w:jc w:val="both"/>
         <w:rPr>
@@ -4803,50 +4955,50 @@
         <w:rPr>
           <w:rFonts w:ascii="Times New Roman" w:hAnsi="Times New Roman" w:cs="Times New Roman"/>
         </w:rPr>
-        <w:t xml:space="preserve">impacts interlayer spacing and can determine </w:t>
+        <w:t>impacts interlayer spacing and can determine which n domains contribute more to</w:t>
+      </w:r>
+      <w:r>
+        <w:rPr>
+          <w:rFonts w:ascii="Times New Roman" w:hAnsi="Times New Roman" w:cs="Times New Roman"/>
+        </w:rPr>
+        <w:t xml:space="preserve"> the </w:t>
+      </w:r>
+      <w:r>
+        <w:rPr>
+          <w:rFonts w:ascii="Times New Roman" w:hAnsi="Times New Roman" w:cs="Times New Roman"/>
+        </w:rPr>
+        <w:t>emission</w:t>
+      </w:r>
+      <w:r>
+        <w:rPr>
+          <w:rFonts w:ascii="Times New Roman" w:hAnsi="Times New Roman" w:cs="Times New Roman"/>
+        </w:rPr>
+        <w:t xml:space="preserve">. </w:t>
+      </w:r>
+      <w:r>
+        <w:rPr>
+          <w:rFonts w:ascii="Times New Roman" w:hAnsi="Times New Roman" w:cs="Times New Roman"/>
+        </w:rPr>
+        <w:t>After</w:t>
+      </w:r>
+      <w:r>
+        <w:rPr>
+          <w:rFonts w:ascii="Times New Roman" w:hAnsi="Times New Roman" w:cs="Times New Roman"/>
+        </w:rPr>
+        <w:t xml:space="preserve"> </w:t>
+      </w:r>
+      <w:r>
+        <w:rPr>
+          <w:rFonts w:ascii="Times New Roman" w:hAnsi="Times New Roman" w:cs="Times New Roman"/>
+        </w:rPr>
+        <w:t xml:space="preserve">splitting the dataset into a training and a </w:t>
       </w:r>
       <w:r>
         <w:rPr>
           <w:rFonts w:ascii="Times New Roman" w:hAnsi="Times New Roman" w:cs="Times New Roman"/>
         </w:rPr>
         <w:lastRenderedPageBreak/>
-        <w:t>which n domains contribute more to</w:t>
-      </w:r>
-      <w:r>
-        <w:rPr>
-          <w:rFonts w:ascii="Times New Roman" w:hAnsi="Times New Roman" w:cs="Times New Roman"/>
-        </w:rPr>
-        <w:t xml:space="preserve"> the </w:t>
-      </w:r>
-      <w:r>
-        <w:rPr>
-          <w:rFonts w:ascii="Times New Roman" w:hAnsi="Times New Roman" w:cs="Times New Roman"/>
-        </w:rPr>
-        <w:t>emission</w:t>
-      </w:r>
-      <w:r>
-        <w:rPr>
-          <w:rFonts w:ascii="Times New Roman" w:hAnsi="Times New Roman" w:cs="Times New Roman"/>
-        </w:rPr>
-        <w:t xml:space="preserve">. </w:t>
-      </w:r>
-      <w:r>
-        <w:rPr>
-          <w:rFonts w:ascii="Times New Roman" w:hAnsi="Times New Roman" w:cs="Times New Roman"/>
-        </w:rPr>
-        <w:t>After</w:t>
-      </w:r>
-      <w:r>
-        <w:rPr>
-          <w:rFonts w:ascii="Times New Roman" w:hAnsi="Times New Roman" w:cs="Times New Roman"/>
-        </w:rPr>
-        <w:t xml:space="preserve"> </w:t>
-      </w:r>
-      <w:r>
-        <w:rPr>
-          <w:rFonts w:ascii="Times New Roman" w:hAnsi="Times New Roman" w:cs="Times New Roman"/>
-        </w:rPr>
-        <w:t>splitting the dataset into a training and a test set, we began feature elimination to prevent the curse of dimensionality using only the training dataset, to</w:t>
+        <w:t>test set, we began feature elimination to prevent the curse of dimensionality using only the training dataset, to</w:t>
       </w:r>
       <w:r>
         <w:rPr>
@@ -5423,6 +5575,7 @@
     <w:p>
       <w:pPr>
         <w:pStyle w:val="BodyText"/>
+        <w:spacing w:before="0" w:after="0"/>
         <w:rPr>
           <w:lang w:val="en-IN"/>
         </w:rPr>
@@ -5431,7 +5584,6 @@
         <w:rPr>
           <w:noProof/>
         </w:rPr>
-        <w:lastRenderedPageBreak/>
         <w:drawing>
           <wp:inline distT="0" distB="0" distL="0" distR="0" wp14:anchorId="54A6E313" wp14:editId="3DED18B5">
             <wp:extent cx="6400291" cy="2589520"/>
@@ -5485,7 +5637,7 @@
     <w:p>
       <w:pPr>
         <w:pStyle w:val="BodyText"/>
-        <w:spacing w:line="480" w:lineRule="auto"/>
+        <w:spacing w:before="0" w:after="160" w:line="480" w:lineRule="auto"/>
         <w:jc w:val="both"/>
         <w:rPr>
           <w:rFonts w:ascii="Times New Roman" w:hAnsi="Times New Roman" w:cs="Times New Roman"/>
@@ -5497,6 +5649,7 @@
           <w:b/>
           <w:bCs/>
         </w:rPr>
+        <w:lastRenderedPageBreak/>
         <w:t xml:space="preserve">Figure </w:t>
       </w:r>
       <w:r>
@@ -5605,7 +5758,7 @@
     <w:p>
       <w:pPr>
         <w:pStyle w:val="BodyText"/>
-        <w:spacing w:line="480" w:lineRule="auto"/>
+        <w:spacing w:before="0" w:after="0" w:line="480" w:lineRule="auto"/>
         <w:ind w:firstLine="720"/>
         <w:jc w:val="both"/>
         <w:rPr>
@@ -6162,14 +6315,7 @@
         <w:rPr>
           <w:rFonts w:ascii="Times New Roman" w:hAnsi="Times New Roman" w:cs="Times New Roman"/>
         </w:rPr>
-        <w:t xml:space="preserve">ormulas </w:t>
-      </w:r>
-      <w:r>
-        <w:rPr>
-          <w:rFonts w:ascii="Times New Roman" w:hAnsi="Times New Roman" w:cs="Times New Roman"/>
-        </w:rPr>
-        <w:lastRenderedPageBreak/>
-        <w:t>for each evaluation metric are defined below</w:t>
+        <w:t>ormulas for each evaluation metric are defined below</w:t>
       </w:r>
       <w:r>
         <w:rPr>
@@ -6441,7 +6587,7 @@
     <w:p>
       <w:pPr>
         <w:pStyle w:val="FirstParagraph"/>
-        <w:spacing w:line="480" w:lineRule="auto"/>
+        <w:spacing w:before="160" w:after="160" w:line="480" w:lineRule="auto"/>
         <w:ind w:firstLine="720"/>
         <w:jc w:val="both"/>
         <w:rPr>
@@ -6454,6 +6600,7 @@
           <w:rFonts w:ascii="Times New Roman" w:hAnsi="Times New Roman" w:cs="Times New Roman"/>
           <w:lang w:val="en-IN"/>
         </w:rPr>
+        <w:lastRenderedPageBreak/>
         <w:t xml:space="preserve">It is crucial to understand that RFECV selects 31 features and achieves a lower training-fold cross-validation error than the 13-feature </w:t>
       </w:r>
       <w:proofErr w:type="spellStart"/>
@@ -6674,7 +6821,7 @@
     <w:p>
       <w:pPr>
         <w:pStyle w:val="BodyText"/>
-        <w:spacing w:line="480" w:lineRule="auto"/>
+        <w:spacing w:before="0" w:after="0" w:line="480" w:lineRule="auto"/>
         <w:jc w:val="both"/>
         <w:rPr>
           <w:rFonts w:ascii="Times New Roman" w:hAnsi="Times New Roman" w:cs="Times New Roman"/>
@@ -7369,7 +7516,6 @@
               <w:rPr>
                 <w:rFonts w:ascii="Times New Roman" w:hAnsi="Times New Roman" w:cs="Times New Roman"/>
               </w:rPr>
-              <w:lastRenderedPageBreak/>
               <w:t>RFECV</w:t>
             </w:r>
           </w:p>
@@ -7742,7 +7888,7 @@
     <w:p>
       <w:pPr>
         <w:pStyle w:val="BodyText"/>
-        <w:spacing w:line="480" w:lineRule="auto"/>
+        <w:spacing w:before="160" w:after="0" w:line="480" w:lineRule="auto"/>
         <w:ind w:firstLine="720"/>
         <w:jc w:val="both"/>
         <w:rPr>
@@ -7931,7 +8077,14 @@
         <w:rPr>
           <w:rFonts w:ascii="Times New Roman" w:hAnsi="Times New Roman" w:cs="Times New Roman"/>
         </w:rPr>
-        <w:t xml:space="preserve">romide-rich precursors generally </w:t>
+        <w:t>romide-</w:t>
+      </w:r>
+      <w:r>
+        <w:rPr>
+          <w:rFonts w:ascii="Times New Roman" w:hAnsi="Times New Roman" w:cs="Times New Roman"/>
+        </w:rPr>
+        <w:lastRenderedPageBreak/>
+        <w:t xml:space="preserve">rich precursors generally </w:t>
       </w:r>
       <w:proofErr w:type="spellStart"/>
       <w:r>
@@ -8164,7 +8317,19 @@
         <w:rPr>
           <w:rFonts w:ascii="Times New Roman" w:hAnsi="Times New Roman" w:cs="Times New Roman"/>
         </w:rPr>
-        <w:t>a critical parameter that controls the average n (number of layers in the inorganic framework) in quasi-2D perovskites</w:t>
+        <w:t xml:space="preserve">a critical parameter that controls the average n (number of layers in the inorganic framework) in </w:t>
+      </w:r>
+      <w:r>
+        <w:rPr>
+          <w:rFonts w:ascii="Times New Roman" w:hAnsi="Times New Roman" w:cs="Times New Roman"/>
+        </w:rPr>
+        <w:t>Q2DPe</w:t>
+      </w:r>
+      <w:r>
+        <w:rPr>
+          <w:rFonts w:ascii="Times New Roman" w:hAnsi="Times New Roman" w:cs="Times New Roman"/>
+        </w:rPr>
+        <w:t>s</w:t>
       </w:r>
       <w:r>
         <w:rPr>
@@ -8451,14 +8616,7 @@
         <w:rPr>
           <w:rFonts w:ascii="Times New Roman" w:hAnsi="Times New Roman" w:cs="Times New Roman"/>
         </w:rPr>
-        <w:t xml:space="preserve"> surviving selection is not </w:t>
-      </w:r>
-      <w:r>
-        <w:rPr>
-          <w:rFonts w:ascii="Times New Roman" w:hAnsi="Times New Roman" w:cs="Times New Roman"/>
-        </w:rPr>
-        <w:lastRenderedPageBreak/>
-        <w:t>surprising</w:t>
+        <w:t xml:space="preserve"> surviving selection is not surprising</w:t>
       </w:r>
       <w:r>
         <w:rPr>
@@ -8668,7 +8826,7 @@
     <w:p>
       <w:pPr>
         <w:pStyle w:val="BodyText"/>
-        <w:spacing w:line="480" w:lineRule="auto"/>
+        <w:spacing w:before="0" w:after="160" w:line="480" w:lineRule="auto"/>
         <w:ind w:firstLine="720"/>
         <w:jc w:val="both"/>
         <w:rPr>
@@ -8679,6 +8837,7 @@
         <w:rPr>
           <w:rFonts w:ascii="Times New Roman" w:hAnsi="Times New Roman" w:cs="Times New Roman"/>
         </w:rPr>
+        <w:lastRenderedPageBreak/>
         <w:t>The 31-variable RFECV set adds</w:t>
       </w:r>
       <w:r>
@@ -8815,7 +8974,7 @@
     <w:p>
       <w:pPr>
         <w:pStyle w:val="BodyText"/>
-        <w:spacing w:line="480" w:lineRule="auto"/>
+        <w:spacing w:before="0" w:after="0" w:line="480" w:lineRule="auto"/>
         <w:jc w:val="both"/>
         <w:rPr>
           <w:rFonts w:ascii="Times New Roman" w:hAnsi="Times New Roman" w:cs="Times New Roman"/>
@@ -8829,13 +8988,29 @@
           <w:b/>
           <w:bCs/>
         </w:rPr>
-        <w:t>SHAP analysis</w:t>
+        <w:t xml:space="preserve">SHAP </w:t>
+      </w:r>
+      <w:r>
+        <w:rPr>
+          <w:rFonts w:ascii="Times New Roman" w:hAnsi="Times New Roman" w:cs="Times New Roman"/>
+          <w:b/>
+          <w:bCs/>
+        </w:rPr>
+        <w:t>A</w:t>
+      </w:r>
+      <w:r>
+        <w:rPr>
+          <w:rFonts w:ascii="Times New Roman" w:hAnsi="Times New Roman" w:cs="Times New Roman"/>
+          <w:b/>
+          <w:bCs/>
+        </w:rPr>
+        <w:t>nalysis</w:t>
       </w:r>
     </w:p>
     <w:p>
       <w:pPr>
         <w:pStyle w:val="BodyText"/>
-        <w:spacing w:line="480" w:lineRule="auto"/>
+        <w:spacing w:before="0" w:after="160" w:line="480" w:lineRule="auto"/>
         <w:jc w:val="both"/>
         <w:rPr>
           <w:rFonts w:ascii="Times New Roman" w:hAnsi="Times New Roman" w:cs="Times New Roman"/>
@@ -9320,7 +9495,6 @@
         <w:rPr>
           <w:rFonts w:ascii="Times New Roman" w:hAnsi="Times New Roman" w:cs="Times New Roman"/>
         </w:rPr>
-        <w:lastRenderedPageBreak/>
         <w:t>standardised</w:t>
       </w:r>
       <w:proofErr w:type="spellEnd"/>
@@ -9443,13 +9617,19 @@
         <w:rPr>
           <w:rFonts w:ascii="Times New Roman" w:hAnsi="Times New Roman" w:cs="Times New Roman"/>
         </w:rPr>
-        <w:t xml:space="preserve"> numerical rankings to quasi-2D </w:t>
-      </w:r>
-      <w:r>
-        <w:rPr>
-          <w:rFonts w:ascii="Times New Roman" w:hAnsi="Times New Roman" w:cs="Times New Roman"/>
-        </w:rPr>
-        <w:t xml:space="preserve">perovskites </w:t>
+        <w:t xml:space="preserve"> numerical rankings to </w:t>
+      </w:r>
+      <w:r>
+        <w:rPr>
+          <w:rFonts w:ascii="Times New Roman" w:hAnsi="Times New Roman" w:cs="Times New Roman"/>
+        </w:rPr>
+        <w:t>Q2DPe</w:t>
+      </w:r>
+      <w:r>
+        <w:rPr>
+          <w:rFonts w:ascii="Times New Roman" w:hAnsi="Times New Roman" w:cs="Times New Roman"/>
+        </w:rPr>
+        <w:t xml:space="preserve">s </w:t>
       </w:r>
       <w:proofErr w:type="spellStart"/>
       <w:r>
@@ -9511,7 +9691,7 @@
     </w:p>
     <w:p>
       <w:pPr>
-        <w:spacing w:line="480" w:lineRule="auto"/>
+        <w:spacing w:after="0" w:line="480" w:lineRule="auto"/>
         <w:jc w:val="both"/>
         <w:rPr>
           <w:rFonts w:ascii="Times New Roman" w:hAnsi="Times New Roman" w:cs="Times New Roman"/>
@@ -9522,6 +9702,7 @@
         <w:rPr>
           <w:noProof/>
         </w:rPr>
+        <w:lastRenderedPageBreak/>
         <w:drawing>
           <wp:inline distT="0" distB="0" distL="0" distR="0" wp14:anchorId="479481C8" wp14:editId="2743B5B7">
             <wp:extent cx="5943600" cy="4712970"/>
@@ -9574,7 +9755,7 @@
     </w:p>
     <w:p>
       <w:pPr>
-        <w:spacing w:line="480" w:lineRule="auto"/>
+        <w:spacing w:after="160" w:line="480" w:lineRule="auto"/>
         <w:jc w:val="both"/>
         <w:rPr>
           <w:rFonts w:ascii="Times New Roman" w:hAnsi="Times New Roman" w:cs="Times New Roman"/>
@@ -9649,7 +9830,7 @@
     <w:p>
       <w:pPr>
         <w:pStyle w:val="BodyText"/>
-        <w:spacing w:line="480" w:lineRule="auto"/>
+        <w:spacing w:before="0" w:after="0" w:line="480" w:lineRule="auto"/>
         <w:jc w:val="both"/>
         <w:rPr>
           <w:rFonts w:ascii="Times New Roman" w:hAnsi="Times New Roman" w:cs="Times New Roman"/>
@@ -9827,7 +10008,6 @@
               <w:rPr>
                 <w:rFonts w:ascii="Times New Roman" w:hAnsi="Times New Roman" w:cs="Times New Roman"/>
               </w:rPr>
-              <w:lastRenderedPageBreak/>
               <w:t>Rank</w:t>
             </w:r>
           </w:p>
@@ -10315,7 +10495,14 @@
               <w:rPr>
                 <w:rFonts w:ascii="Times New Roman" w:hAnsi="Times New Roman" w:cs="Times New Roman"/>
               </w:rPr>
-              <w:t xml:space="preserve">Bromide on the primary ammonium spacer increases halide incorporation on the organic site and blue-shifts the emitting manifold relative to iodide-only </w:t>
+              <w:t xml:space="preserve">Bromide on the primary ammonium spacer increases halide </w:t>
+            </w:r>
+            <w:r>
+              <w:rPr>
+                <w:rFonts w:ascii="Times New Roman" w:hAnsi="Times New Roman" w:cs="Times New Roman"/>
+              </w:rPr>
+              <w:lastRenderedPageBreak/>
+              <w:t xml:space="preserve">incorporation on the organic site and blue-shifts the emitting manifold relative to iodide-only </w:t>
             </w:r>
             <w:proofErr w:type="spellStart"/>
             <w:r>
@@ -10350,6 +10537,7 @@
               <w:rPr>
                 <w:rFonts w:ascii="Times New Roman" w:hAnsi="Times New Roman" w:cs="Times New Roman"/>
               </w:rPr>
+              <w:lastRenderedPageBreak/>
               <w:t>3</w:t>
             </w:r>
           </w:p>
@@ -10483,7 +10671,25 @@
               <w:rPr>
                 <w:rFonts w:ascii="Times New Roman" w:hAnsi="Times New Roman" w:cs="Times New Roman"/>
               </w:rPr>
-              <w:t xml:space="preserve"> iodide fraction enriches iodide character and lowers the effective gap—consistent with red-shifted quasi-2D PL/EL when iodide dominates.</w:t>
+              <w:t xml:space="preserve"> iodide fraction enriches iodide character and lowers the effective gap—consistent with red-shifted </w:t>
+            </w:r>
+            <w:r>
+              <w:rPr>
+                <w:rFonts w:ascii="Times New Roman" w:hAnsi="Times New Roman" w:cs="Times New Roman"/>
+              </w:rPr>
+              <w:t>Q2DPe</w:t>
+            </w:r>
+            <w:r>
+              <w:rPr>
+                <w:rFonts w:ascii="Times New Roman" w:hAnsi="Times New Roman" w:cs="Times New Roman"/>
+              </w:rPr>
+              <w:t xml:space="preserve"> </w:t>
+            </w:r>
+            <w:r>
+              <w:rPr>
+                <w:rFonts w:ascii="Times New Roman" w:hAnsi="Times New Roman" w:cs="Times New Roman"/>
+              </w:rPr>
+              <w:t>PL/EL when iodide dominates.</w:t>
             </w:r>
           </w:p>
         </w:tc>
@@ -11033,7 +11239,6 @@
               <w:rPr>
                 <w:rFonts w:ascii="Times New Roman" w:hAnsi="Times New Roman" w:cs="Times New Roman"/>
               </w:rPr>
-              <w:lastRenderedPageBreak/>
               <w:t>7</w:t>
             </w:r>
           </w:p>
@@ -11299,7 +11504,14 @@
               <w:rPr>
                 <w:rFonts w:ascii="Times New Roman" w:hAnsi="Times New Roman" w:cs="Times New Roman"/>
               </w:rPr>
-              <w:t xml:space="preserve"> fraction modulates A-site/halide balance; weaker monotonic trend because Cs appears with mixed halides across papers.</w:t>
+              <w:t xml:space="preserve"> fraction modulates A-site/halide balance; </w:t>
+            </w:r>
+            <w:r>
+              <w:rPr>
+                <w:rFonts w:ascii="Times New Roman" w:hAnsi="Times New Roman" w:cs="Times New Roman"/>
+              </w:rPr>
+              <w:lastRenderedPageBreak/>
+              <w:t>weaker monotonic trend because Cs appears with mixed halides across papers.</w:t>
             </w:r>
           </w:p>
         </w:tc>
@@ -11320,6 +11532,7 @@
               <w:rPr>
                 <w:rFonts w:ascii="Times New Roman" w:hAnsi="Times New Roman" w:cs="Times New Roman"/>
               </w:rPr>
+              <w:lastRenderedPageBreak/>
               <w:t>9</w:t>
             </w:r>
           </w:p>
@@ -12079,27 +12292,7 @@
     </w:tbl>
     <w:p>
       <w:pPr>
-        <w:pStyle w:val="BodyText"/>
-        <w:spacing w:line="480" w:lineRule="auto"/>
-        <w:jc w:val="both"/>
-        <w:rPr>
-          <w:rFonts w:ascii="Times New Roman" w:hAnsi="Times New Roman" w:cs="Times New Roman"/>
-          <w:b/>
-          <w:bCs/>
-        </w:rPr>
-      </w:pPr>
-      <w:r>
-        <w:rPr>
-          <w:rFonts w:ascii="Times New Roman" w:hAnsi="Times New Roman" w:cs="Times New Roman"/>
-          <w:b/>
-          <w:bCs/>
-        </w:rPr>
-        <w:lastRenderedPageBreak/>
-        <w:br w:type="textWrapping" w:clear="all"/>
-      </w:r>
-    </w:p>
-    <w:p>
-      <w:pPr>
+        <w:spacing w:before="160" w:after="0" w:line="480" w:lineRule="auto"/>
         <w:rPr>
           <w:rFonts w:ascii="Times New Roman" w:hAnsi="Times New Roman" w:cs="Times New Roman"/>
           <w:b/>
@@ -12153,7 +12346,7 @@
     <w:p>
       <w:pPr>
         <w:pStyle w:val="BodyText"/>
-        <w:spacing w:line="480" w:lineRule="auto"/>
+        <w:spacing w:before="0" w:after="160" w:line="480" w:lineRule="auto"/>
         <w:jc w:val="both"/>
         <w:rPr>
           <w:rFonts w:ascii="Times New Roman" w:hAnsi="Times New Roman" w:cs="Times New Roman"/>
@@ -12232,21 +12425,25 @@
         <w:rPr>
           <w:rFonts w:ascii="Times New Roman" w:hAnsi="Times New Roman" w:cs="Times New Roman"/>
         </w:rPr>
-        <w:t xml:space="preserve"> of the Quasi 2D </w:t>
-      </w:r>
-      <w:proofErr w:type="spellStart"/>
-      <w:r>
-        <w:rPr>
-          <w:rFonts w:ascii="Times New Roman" w:hAnsi="Times New Roman" w:cs="Times New Roman"/>
-        </w:rPr>
-        <w:t>PeLEDs</w:t>
-      </w:r>
-      <w:proofErr w:type="spellEnd"/>
-      <w:r>
-        <w:rPr>
-          <w:rFonts w:ascii="Times New Roman" w:hAnsi="Times New Roman" w:cs="Times New Roman"/>
-        </w:rPr>
-        <w:t xml:space="preserve">, we prepared a curated dataset of </w:t>
+        <w:t xml:space="preserve"> of the </w:t>
+      </w:r>
+      <w:r>
+        <w:rPr>
+          <w:rFonts w:ascii="Times New Roman" w:hAnsi="Times New Roman" w:cs="Times New Roman"/>
+        </w:rPr>
+        <w:t>Q2DPe</w:t>
+      </w:r>
+      <w:r>
+        <w:rPr>
+          <w:rFonts w:ascii="Times New Roman" w:hAnsi="Times New Roman" w:cs="Times New Roman"/>
+        </w:rPr>
+        <w:t xml:space="preserve"> </w:t>
+      </w:r>
+      <w:r>
+        <w:rPr>
+          <w:rFonts w:ascii="Times New Roman" w:hAnsi="Times New Roman" w:cs="Times New Roman"/>
+        </w:rPr>
+        <w:t xml:space="preserve">LEDs, we prepared a curated dataset of </w:t>
       </w:r>
       <w:r>
         <w:rPr>
@@ -12276,7 +12473,14 @@
         <w:rPr>
           <w:rFonts w:ascii="Times New Roman" w:hAnsi="Times New Roman" w:cs="Times New Roman"/>
         </w:rPr>
-        <w:t xml:space="preserve">with hole-transport material (HTL), electron-transport material (ETL), additive, and </w:t>
+        <w:t>with hole-transport material (HTL), electron-</w:t>
+      </w:r>
+      <w:r>
+        <w:rPr>
+          <w:rFonts w:ascii="Times New Roman" w:hAnsi="Times New Roman" w:cs="Times New Roman"/>
+        </w:rPr>
+        <w:lastRenderedPageBreak/>
+        <w:t xml:space="preserve">transport material (ETL), additive, and </w:t>
       </w:r>
       <w:r>
         <w:rPr>
@@ -12670,7 +12874,7 @@
     <w:p>
       <w:pPr>
         <w:pStyle w:val="BodyText"/>
-        <w:spacing w:line="480" w:lineRule="auto"/>
+        <w:spacing w:before="0" w:after="0" w:line="480" w:lineRule="auto"/>
         <w:jc w:val="both"/>
         <w:rPr>
           <w:rFonts w:ascii="Times New Roman" w:hAnsi="Times New Roman" w:cs="Times New Roman"/>
@@ -12776,7 +12980,6 @@
               <w:rPr>
                 <w:rFonts w:ascii="Times New Roman" w:hAnsi="Times New Roman" w:cs="Times New Roman"/>
               </w:rPr>
-              <w:lastRenderedPageBreak/>
               <w:t>Model</w:t>
             </w:r>
           </w:p>
@@ -13225,7 +13428,7 @@
     <w:p>
       <w:pPr>
         <w:pStyle w:val="BodyText"/>
-        <w:spacing w:line="480" w:lineRule="auto"/>
+        <w:spacing w:before="160" w:after="160" w:line="480" w:lineRule="auto"/>
         <w:ind w:firstLine="720"/>
         <w:jc w:val="both"/>
         <w:rPr>
@@ -13348,7 +13551,14 @@
         <w:rPr>
           <w:rFonts w:ascii="Times New Roman" w:hAnsi="Times New Roman" w:cs="Times New Roman"/>
         </w:rPr>
-        <w:t xml:space="preserve"> balance and outcoupling. Pinhole-free morphology, interfacial trap passivation, </w:t>
+        <w:t xml:space="preserve"> balance and </w:t>
+      </w:r>
+      <w:r>
+        <w:rPr>
+          <w:rFonts w:ascii="Times New Roman" w:hAnsi="Times New Roman" w:cs="Times New Roman"/>
+        </w:rPr>
+        <w:lastRenderedPageBreak/>
+        <w:t xml:space="preserve">outcoupling. Pinhole-free morphology, interfacial trap passivation, </w:t>
       </w:r>
       <w:r>
         <w:rPr>
@@ -13525,7 +13735,7 @@
     <w:p>
       <w:pPr>
         <w:pStyle w:val="BodyText"/>
-        <w:spacing w:line="480" w:lineRule="auto"/>
+        <w:spacing w:before="0" w:after="0" w:line="480" w:lineRule="auto"/>
         <w:jc w:val="both"/>
         <w:rPr>
           <w:rFonts w:ascii="Times New Roman" w:hAnsi="Times New Roman" w:cs="Times New Roman"/>
@@ -13591,7 +13801,7 @@
     <w:p>
       <w:pPr>
         <w:pStyle w:val="BodyText"/>
-        <w:spacing w:line="480" w:lineRule="auto"/>
+        <w:spacing w:before="0" w:after="160" w:line="480" w:lineRule="auto"/>
         <w:jc w:val="both"/>
         <w:rPr>
           <w:rFonts w:ascii="Times New Roman" w:hAnsi="Times New Roman" w:cs="Times New Roman"/>
@@ -13622,6 +13832,7 @@
     </w:p>
     <w:p>
       <w:pPr>
+        <w:spacing w:after="0" w:line="480" w:lineRule="auto"/>
         <w:rPr>
           <w:rFonts w:ascii="Times New Roman" w:hAnsi="Times New Roman" w:cs="Times New Roman"/>
           <w:b/>
@@ -13643,8 +13854,7 @@
     <w:p>
       <w:pPr>
         <w:pStyle w:val="FirstParagraph"/>
-        <w:spacing w:line="480" w:lineRule="auto"/>
-        <w:ind w:firstLine="720"/>
+        <w:spacing w:before="0" w:after="0" w:line="480" w:lineRule="auto"/>
         <w:jc w:val="both"/>
         <w:rPr>
           <w:rFonts w:ascii="Times New Roman" w:hAnsi="Times New Roman" w:cs="Times New Roman"/>
@@ -13685,7 +13895,25 @@
         <w:rPr>
           <w:rFonts w:ascii="Times New Roman" w:hAnsi="Times New Roman" w:cs="Times New Roman"/>
         </w:rPr>
-        <w:t xml:space="preserve">from the available literature on quasi-2D perovskites, focusing on emission energy and </w:t>
+        <w:t xml:space="preserve">from the available literature on </w:t>
+      </w:r>
+      <w:r>
+        <w:rPr>
+          <w:rFonts w:ascii="Times New Roman" w:hAnsi="Times New Roman" w:cs="Times New Roman"/>
+        </w:rPr>
+        <w:t>Q2DPe</w:t>
+      </w:r>
+      <w:r>
+        <w:rPr>
+          <w:rFonts w:ascii="Times New Roman" w:hAnsi="Times New Roman" w:cs="Times New Roman"/>
+        </w:rPr>
+        <w:t>s</w:t>
+      </w:r>
+      <w:r>
+        <w:rPr>
+          <w:rFonts w:ascii="Times New Roman" w:hAnsi="Times New Roman" w:cs="Times New Roman"/>
+        </w:rPr>
+        <w:t xml:space="preserve">, focusing on emission energy and </w:t>
       </w:r>
       <w:r>
         <w:rPr>
@@ -13777,7 +14005,7 @@
     <w:p>
       <w:pPr>
         <w:pStyle w:val="FirstParagraph"/>
-        <w:spacing w:line="480" w:lineRule="auto"/>
+        <w:spacing w:before="0" w:after="0" w:line="480" w:lineRule="auto"/>
         <w:ind w:firstLine="720"/>
         <w:jc w:val="both"/>
         <w:rPr>
@@ -14079,7 +14307,8 @@
     <w:p>
       <w:pPr>
         <w:pStyle w:val="FirstParagraph"/>
-        <w:spacing w:line="480" w:lineRule="auto"/>
+        <w:spacing w:before="0" w:after="160" w:line="480" w:lineRule="auto"/>
+        <w:ind w:firstLine="720"/>
         <w:jc w:val="both"/>
         <w:rPr>
           <w:rFonts w:ascii="Times New Roman" w:hAnsi="Times New Roman" w:cs="Times New Roman"/>
@@ -14237,14 +14466,14 @@
         <w:rPr>
           <w:rFonts w:ascii="Times New Roman" w:hAnsi="Times New Roman" w:cs="Times New Roman"/>
         </w:rPr>
-        <w:t xml:space="preserve">metrics such as EQE remain </w:t>
+        <w:t xml:space="preserve">metrics such as EQE </w:t>
       </w:r>
       <w:r>
         <w:rPr>
           <w:rFonts w:ascii="Times New Roman" w:hAnsi="Times New Roman" w:cs="Times New Roman"/>
         </w:rPr>
         <w:lastRenderedPageBreak/>
-        <w:t xml:space="preserve">fundamentally unlearnable across heterogeneous literature sources without strictly </w:t>
+        <w:t xml:space="preserve">remain fundamentally unlearnable across heterogeneous literature sources without strictly </w:t>
       </w:r>
       <w:proofErr w:type="spellStart"/>
       <w:r>
@@ -14282,7 +14511,7 @@
     <w:p>
       <w:pPr>
         <w:pStyle w:val="FirstParagraph"/>
-        <w:spacing w:line="480" w:lineRule="auto"/>
+        <w:spacing w:before="0" w:after="0" w:line="480" w:lineRule="auto"/>
         <w:jc w:val="both"/>
         <w:rPr>
           <w:rFonts w:ascii="Times New Roman" w:eastAsia="MS Mincho" w:hAnsi="Times New Roman" w:cs="Times New Roman"/>
@@ -14304,7 +14533,7 @@
     <w:p>
       <w:pPr>
         <w:pStyle w:val="FirstParagraph"/>
-        <w:spacing w:line="480" w:lineRule="auto"/>
+        <w:spacing w:before="0" w:after="160" w:line="480" w:lineRule="auto"/>
         <w:jc w:val="both"/>
         <w:rPr>
           <w:rFonts w:ascii="Times New Roman" w:hAnsi="Times New Roman" w:cs="Times New Roman"/>
@@ -14354,6 +14583,7 @@
     <w:p>
       <w:pPr>
         <w:pStyle w:val="TAMainText"/>
+        <w:spacing w:after="160"/>
         <w:ind w:firstLine="0"/>
       </w:pPr>
       <w:r>
@@ -14364,13 +14594,11 @@
       <w:pPr>
         <w:pStyle w:val="FAAuthorInfoSubtitle"/>
         <w:rPr>
-          <w:b/>
           <w:lang w:val="en-IN"/>
         </w:rPr>
       </w:pPr>
       <w:r>
         <w:rPr>
-          <w:b/>
           <w:lang w:val="en-IN"/>
         </w:rPr>
         <w:t>Author contributions</w:t>
@@ -14381,7 +14609,6 @@
         <w:pStyle w:val="FAAuthorInfoSubtitle"/>
         <w:rPr>
           <w:b/>
-          <w:bCs w:val="0"/>
         </w:rPr>
       </w:pPr>
       <w:proofErr w:type="spellStart"/>
@@ -14501,7 +14728,7 @@
     <w:p>
       <w:pPr>
         <w:pStyle w:val="Acknowledgements"/>
-        <w:spacing w:line="480" w:lineRule="auto"/>
+        <w:spacing w:after="160" w:line="480" w:lineRule="auto"/>
         <w:jc w:val="both"/>
         <w:rPr>
           <w:rFonts w:eastAsia="Times New Roman"/>
@@ -14546,7 +14773,7 @@
     <w:p>
       <w:pPr>
         <w:pStyle w:val="Acknowledgements"/>
-        <w:spacing w:line="480" w:lineRule="auto"/>
+        <w:spacing w:after="160" w:line="480" w:lineRule="auto"/>
         <w:jc w:val="both"/>
         <w:rPr>
           <w:rFonts w:eastAsia="Times New Roman"/>
@@ -16078,6 +16305,7 @@
   <w:style w:type="character" w:default="1" w:styleId="DefaultParagraphFont">
     <w:name w:val="Default Paragraph Font"/>
     <w:uiPriority w:val="1"/>
+    <w:semiHidden/>
     <w:unhideWhenUsed/>
   </w:style>
   <w:style w:type="table" w:default="1" w:styleId="TableNormal">
@@ -17050,9 +17278,9 @@
     <w:basedOn w:val="Normal"/>
     <w:link w:val="FAAuthorInfoSubtitleChar"/>
     <w:autoRedefine/>
-    <w:rsid w:val="00287DEA"/>
+    <w:rsid w:val="00AB18F9"/>
     <w:pPr>
-      <w:spacing w:before="120" w:after="60" w:line="480" w:lineRule="auto"/>
+      <w:spacing w:after="160" w:line="480" w:lineRule="auto"/>
       <w:jc w:val="both"/>
     </w:pPr>
     <w:rPr>
@@ -17065,7 +17293,7 @@
   <w:style w:type="character" w:customStyle="1" w:styleId="FAAuthorInfoSubtitleChar">
     <w:name w:val="FA_Author_Info_Subtitle Char"/>
     <w:link w:val="FAAuthorInfoSubtitle"/>
-    <w:rsid w:val="00287DEA"/>
+    <w:rsid w:val="00AB18F9"/>
     <w:rPr>
       <w:rFonts w:ascii="Times" w:eastAsia="Times New Roman" w:hAnsi="Times" w:cs="Times New Roman"/>
       <w:bCs/>

</xml_diff>